<commit_message>
Fix document layout: replace empty filler paragraphs with page break
Templates had 51 (AIRCO) and 61 (WP) empty paragraphs between the
specification section and Levertijd to force page layout. Replaced
with a single explicit page break so Levertijd always starts on a
new page regardless of specification content length.

Co-Authored-By: Claude Sonnet 4.6 <noreply@anthropic.com>
</commit_message>
<xml_diff>
--- a/templates/SJABLOON-DKT-AIRCO.docx
+++ b/templates/SJABLOON-DKT-AIRCO.docx
@@ -2045,995 +2045,8 @@
       </w:r>
     </w:p>
     <w:p>
-      <w:pPr>
-        <w:spacing w:after="0" w:line="240" w:lineRule="auto"/>
-        <w:jc w:val="both"/>
-        <w:rPr>
-          <w:rFonts w:ascii="Calibri" w:cs="Calibri" w:eastAsia="Calibri" w:hAnsi="Calibri"/>
-          <w:color w:val="000000"/>
-          <w:sz w:val="20"/>
-          <w:szCs w:val="20"/>
-        </w:rPr>
-      </w:pPr>
-      <w:r>
-        <w:rPr>
-          <w:rFonts w:ascii="Calibri" w:cs="Calibri" w:eastAsia="Calibri" w:hAnsi="Calibri"/>
-          <w:color w:val="000000"/>
-          <w:sz w:val="20"/>
-          <w:szCs w:val="20"/>
-          <w:rtl w:val="0"/>
-        </w:rPr>
-        <w:t xml:space="preserve"> </w:t>
-      </w:r>
-    </w:p>
-    <w:p>
-      <w:pPr>
-        <w:spacing w:after="0" w:line="240" w:lineRule="auto"/>
-        <w:jc w:val="both"/>
-        <w:rPr>
-          <w:rFonts w:ascii="Calibri" w:cs="Calibri" w:eastAsia="Calibri" w:hAnsi="Calibri"/>
-          <w:color w:val="000000"/>
-          <w:sz w:val="20"/>
-          <w:szCs w:val="20"/>
-        </w:rPr>
-      </w:pPr>
-      <w:r>
-        <w:rPr>
-          <w:rtl w:val="0"/>
-        </w:rPr>
-      </w:r>
-    </w:p>
-    <w:p>
-      <w:pPr>
-        <w:spacing w:after="0" w:line="240" w:lineRule="auto"/>
-        <w:jc w:val="both"/>
-        <w:rPr>
-          <w:rFonts w:ascii="Calibri" w:cs="Calibri" w:eastAsia="Calibri" w:hAnsi="Calibri"/>
-          <w:color w:val="000000"/>
-          <w:sz w:val="20"/>
-          <w:szCs w:val="20"/>
-        </w:rPr>
-      </w:pPr>
-      <w:r>
-        <w:rPr>
-          <w:rtl w:val="0"/>
-        </w:rPr>
-      </w:r>
-    </w:p>
-    <w:p>
-      <w:pPr>
-        <w:spacing w:after="0" w:line="240" w:lineRule="auto"/>
-        <w:jc w:val="both"/>
-        <w:rPr>
-          <w:rFonts w:ascii="Calibri" w:cs="Calibri" w:eastAsia="Calibri" w:hAnsi="Calibri"/>
-          <w:color w:val="000000"/>
-          <w:sz w:val="20"/>
-          <w:szCs w:val="20"/>
-        </w:rPr>
-      </w:pPr>
-      <w:r>
-        <w:rPr>
-          <w:rtl w:val="0"/>
-        </w:rPr>
-      </w:r>
-    </w:p>
-    <w:p>
-      <w:pPr>
-        <w:spacing w:after="0" w:line="240" w:lineRule="auto"/>
-        <w:jc w:val="both"/>
-        <w:rPr>
-          <w:rFonts w:ascii="Calibri" w:cs="Calibri" w:eastAsia="Calibri" w:hAnsi="Calibri"/>
-          <w:color w:val="000000"/>
-          <w:sz w:val="20"/>
-          <w:szCs w:val="20"/>
-        </w:rPr>
-      </w:pPr>
-      <w:r>
-        <w:rPr>
-          <w:rtl w:val="0"/>
-        </w:rPr>
-      </w:r>
-    </w:p>
-    <w:p>
-      <w:pPr>
-        <w:spacing w:after="0" w:line="240" w:lineRule="auto"/>
-        <w:jc w:val="both"/>
-        <w:rPr>
-          <w:rFonts w:ascii="Calibri" w:cs="Calibri" w:eastAsia="Calibri" w:hAnsi="Calibri"/>
-          <w:color w:val="000000"/>
-          <w:sz w:val="20"/>
-          <w:szCs w:val="20"/>
-        </w:rPr>
-      </w:pPr>
-      <w:r>
-        <w:rPr>
-          <w:rtl w:val="0"/>
-        </w:rPr>
-      </w:r>
-    </w:p>
-    <w:p>
-      <w:pPr>
-        <w:spacing w:after="0" w:line="240" w:lineRule="auto"/>
-        <w:jc w:val="both"/>
-        <w:rPr>
-          <w:rFonts w:ascii="Calibri" w:cs="Calibri" w:eastAsia="Calibri" w:hAnsi="Calibri"/>
-          <w:color w:val="000000"/>
-          <w:sz w:val="20"/>
-          <w:szCs w:val="20"/>
-        </w:rPr>
-      </w:pPr>
-      <w:r>
-        <w:rPr>
-          <w:rtl w:val="0"/>
-        </w:rPr>
-      </w:r>
-    </w:p>
-    <w:p>
-      <w:pPr>
-        <w:spacing w:after="0" w:line="240" w:lineRule="auto"/>
-        <w:jc w:val="both"/>
-        <w:rPr>
-          <w:rFonts w:ascii="Calibri" w:cs="Calibri" w:eastAsia="Calibri" w:hAnsi="Calibri"/>
-          <w:color w:val="000000"/>
-          <w:sz w:val="20"/>
-          <w:szCs w:val="20"/>
-        </w:rPr>
-      </w:pPr>
-      <w:r>
-        <w:rPr>
-          <w:rtl w:val="0"/>
-        </w:rPr>
-      </w:r>
-    </w:p>
-    <w:p>
-      <w:pPr>
-        <w:spacing w:after="0" w:line="240" w:lineRule="auto"/>
-        <w:jc w:val="both"/>
-        <w:rPr>
-          <w:rFonts w:ascii="Calibri" w:cs="Calibri" w:eastAsia="Calibri" w:hAnsi="Calibri"/>
-          <w:color w:val="000000"/>
-          <w:sz w:val="20"/>
-          <w:szCs w:val="20"/>
-        </w:rPr>
-      </w:pPr>
-      <w:r>
-        <w:rPr>
-          <w:rtl w:val="0"/>
-        </w:rPr>
-      </w:r>
-    </w:p>
-    <w:p>
-      <w:pPr>
-        <w:spacing w:after="0" w:line="240" w:lineRule="auto"/>
-        <w:jc w:val="both"/>
-        <w:rPr>
-          <w:rFonts w:ascii="Calibri" w:cs="Calibri" w:eastAsia="Calibri" w:hAnsi="Calibri"/>
-          <w:color w:val="000000"/>
-          <w:sz w:val="20"/>
-          <w:szCs w:val="20"/>
-        </w:rPr>
-      </w:pPr>
-      <w:r>
-        <w:rPr>
-          <w:rtl w:val="0"/>
-        </w:rPr>
-      </w:r>
-    </w:p>
-    <w:p>
-      <w:pPr>
-        <w:spacing w:after="0" w:line="240" w:lineRule="auto"/>
-        <w:jc w:val="both"/>
-        <w:rPr>
-          <w:rFonts w:ascii="Calibri" w:cs="Calibri" w:eastAsia="Calibri" w:hAnsi="Calibri"/>
-          <w:color w:val="000000"/>
-          <w:sz w:val="20"/>
-          <w:szCs w:val="20"/>
-        </w:rPr>
-      </w:pPr>
-      <w:r>
-        <w:rPr>
-          <w:rtl w:val="0"/>
-        </w:rPr>
-      </w:r>
-    </w:p>
-    <w:p>
-      <w:pPr>
-        <w:spacing w:after="0" w:line="240" w:lineRule="auto"/>
-        <w:jc w:val="both"/>
-        <w:rPr>
-          <w:rFonts w:ascii="Calibri" w:cs="Calibri" w:eastAsia="Calibri" w:hAnsi="Calibri"/>
-          <w:color w:val="000000"/>
-          <w:sz w:val="20"/>
-          <w:szCs w:val="20"/>
-        </w:rPr>
-      </w:pPr>
-      <w:r>
-        <w:rPr>
-          <w:rtl w:val="0"/>
-        </w:rPr>
-      </w:r>
-    </w:p>
-    <w:p>
-      <w:pPr>
-        <w:spacing w:after="0" w:line="240" w:lineRule="auto"/>
-        <w:jc w:val="both"/>
-        <w:rPr>
-          <w:rFonts w:ascii="Calibri" w:cs="Calibri" w:eastAsia="Calibri" w:hAnsi="Calibri"/>
-          <w:color w:val="000000"/>
-          <w:sz w:val="20"/>
-          <w:szCs w:val="20"/>
-        </w:rPr>
-      </w:pPr>
-      <w:r>
-        <w:rPr>
-          <w:sz w:val="20"/>
-          <w:szCs w:val="20"/>
-        </w:rPr>
-        <w:drawing>
-          <wp:anchor allowOverlap="1" behindDoc="1" distB="0" distT="0" distL="0" distR="0" hidden="0" layoutInCell="1" locked="0" relativeHeight="0" simplePos="0">
-            <wp:simplePos x="0" y="0"/>
-            <wp:positionH relativeFrom="page">
-              <wp:posOffset>972000</wp:posOffset>
-            </wp:positionH>
-            <wp:positionV relativeFrom="page">
-              <wp:posOffset>3420000</wp:posOffset>
-            </wp:positionV>
-            <wp:extent cx="5791200" cy="5791200"/>
-            <wp:effectExtent b="0" l="0" r="0" t="0"/>
-            <wp:wrapNone/>
-            <wp:docPr descr="Afbeelding met cirkel, Graphics, logo, ontwerp&#10;&#10;Automatisch gegenereerde beschrijving" id="6" name="image2.png"/>
-            <a:graphic>
-              <a:graphicData uri="http://schemas.openxmlformats.org/drawingml/2006/picture">
-                <pic:pic>
-                  <pic:nvPicPr>
-                    <pic:cNvPr descr="Afbeelding met cirkel, Graphics, logo, ontwerp&#10;&#10;Automatisch gegenereerde beschrijving" id="0" name="image2.png"/>
-                    <pic:cNvPicPr preferRelativeResize="0"/>
-                  </pic:nvPicPr>
-                  <pic:blipFill>
-                    <a:blip r:embed="rId10"/>
-                    <a:srcRect b="0" l="0" r="0" t="0"/>
-                    <a:stretch>
-                      <a:fillRect/>
-                    </a:stretch>
-                  </pic:blipFill>
-                  <pic:spPr>
-                    <a:xfrm>
-                      <a:off x="0" y="0"/>
-                      <a:ext cx="5791200" cy="5791200"/>
-                    </a:xfrm>
-                    <a:prstGeom prst="rect"/>
-                    <a:ln/>
-                  </pic:spPr>
-                </pic:pic>
-              </a:graphicData>
-            </a:graphic>
-          </wp:anchor>
-        </w:drawing>
-      </w:r>
-      <w:r>
-        <w:rPr>
-          <w:rtl w:val="0"/>
-        </w:rPr>
-      </w:r>
-    </w:p>
-    <w:p>
-      <w:pPr>
-        <w:spacing w:after="0" w:line="240" w:lineRule="auto"/>
-        <w:jc w:val="both"/>
-        <w:rPr>
-          <w:rFonts w:ascii="Calibri" w:cs="Calibri" w:eastAsia="Calibri" w:hAnsi="Calibri"/>
-          <w:color w:val="000000"/>
-          <w:sz w:val="20"/>
-          <w:szCs w:val="20"/>
-        </w:rPr>
-      </w:pPr>
-      <w:r>
-        <w:rPr>
-          <w:rtl w:val="0"/>
-        </w:rPr>
-      </w:r>
-    </w:p>
-    <w:p>
-      <w:pPr>
-        <w:spacing w:after="0" w:line="240" w:lineRule="auto"/>
-        <w:jc w:val="both"/>
-        <w:rPr>
-          <w:rFonts w:ascii="Calibri" w:cs="Calibri" w:eastAsia="Calibri" w:hAnsi="Calibri"/>
-          <w:color w:val="000000"/>
-          <w:sz w:val="20"/>
-          <w:szCs w:val="20"/>
-        </w:rPr>
-      </w:pPr>
-      <w:r>
-        <w:rPr>
-          <w:rtl w:val="0"/>
-        </w:rPr>
-      </w:r>
-    </w:p>
-    <w:p>
-      <w:pPr>
-        <w:spacing w:after="0" w:line="240" w:lineRule="auto"/>
-        <w:jc w:val="both"/>
-        <w:rPr>
-          <w:rFonts w:ascii="Calibri" w:cs="Calibri" w:eastAsia="Calibri" w:hAnsi="Calibri"/>
-          <w:color w:val="000000"/>
-          <w:sz w:val="20"/>
-          <w:szCs w:val="20"/>
-        </w:rPr>
-      </w:pPr>
-      <w:r>
-        <w:rPr>
-          <w:rtl w:val="0"/>
-        </w:rPr>
-      </w:r>
-    </w:p>
-    <w:p>
-      <w:pPr>
-        <w:spacing w:after="0" w:line="240" w:lineRule="auto"/>
-        <w:jc w:val="both"/>
-        <w:rPr>
-          <w:rFonts w:ascii="Calibri" w:cs="Calibri" w:eastAsia="Calibri" w:hAnsi="Calibri"/>
-          <w:color w:val="000000"/>
-          <w:sz w:val="20"/>
-          <w:szCs w:val="20"/>
-        </w:rPr>
-      </w:pPr>
-      <w:r>
-        <w:rPr>
-          <w:rFonts w:ascii="Calibri" w:cs="Calibri" w:eastAsia="Calibri" w:hAnsi="Calibri"/>
-          <w:color w:val="000000"/>
-          <w:sz w:val="20"/>
-          <w:szCs w:val="20"/>
-          <w:rtl w:val="0"/>
-        </w:rPr>
-        <w:t xml:space="preserve"> </w:t>
-      </w:r>
-    </w:p>
-    <w:p>
-      <w:pPr>
-        <w:spacing w:after="0" w:line="240" w:lineRule="auto"/>
-        <w:jc w:val="both"/>
-        <w:rPr>
-          <w:rFonts w:ascii="Calibri" w:cs="Calibri" w:eastAsia="Calibri" w:hAnsi="Calibri"/>
-          <w:color w:val="000000"/>
-          <w:sz w:val="20"/>
-          <w:szCs w:val="20"/>
-        </w:rPr>
-      </w:pPr>
-      <w:r>
-        <w:rPr>
-          <w:rtl w:val="0"/>
-        </w:rPr>
-      </w:r>
-    </w:p>
-    <w:p>
-      <w:pPr>
-        <w:spacing w:after="0" w:line="240" w:lineRule="auto"/>
-        <w:jc w:val="both"/>
-        <w:rPr>
-          <w:rFonts w:ascii="Calibri" w:cs="Calibri" w:eastAsia="Calibri" w:hAnsi="Calibri"/>
-          <w:b w:val="1"/>
-          <w:bCs w:val="1"/>
-          <w:color w:val="000000"/>
-          <w:sz w:val="20"/>
-          <w:szCs w:val="20"/>
-        </w:rPr>
-      </w:pPr>
-      <w:r>
-        <w:rPr>
-          <w:rtl w:val="0"/>
-        </w:rPr>
-      </w:r>
-    </w:p>
-    <w:p>
-      <w:pPr>
-        <w:spacing w:after="0" w:line="240" w:lineRule="auto"/>
-        <w:jc w:val="both"/>
-        <w:rPr>
-          <w:rFonts w:ascii="Calibri" w:cs="Calibri" w:eastAsia="Calibri" w:hAnsi="Calibri"/>
-          <w:b w:val="1"/>
-          <w:bCs w:val="1"/>
-          <w:color w:val="000000"/>
-          <w:sz w:val="20"/>
-          <w:szCs w:val="20"/>
-        </w:rPr>
-      </w:pPr>
-      <w:r>
-        <w:rPr>
-          <w:rtl w:val="0"/>
-        </w:rPr>
-      </w:r>
-    </w:p>
-    <w:p>
-      <w:pPr>
-        <w:spacing w:after="0" w:line="240" w:lineRule="auto"/>
-        <w:jc w:val="both"/>
-        <w:rPr>
-          <w:rFonts w:ascii="Calibri" w:cs="Calibri" w:eastAsia="Calibri" w:hAnsi="Calibri"/>
-          <w:b w:val="1"/>
-          <w:bCs w:val="1"/>
-          <w:color w:val="000000"/>
-          <w:sz w:val="20"/>
-          <w:szCs w:val="20"/>
-        </w:rPr>
-      </w:pPr>
-      <w:r>
-        <w:rPr>
-          <w:rtl w:val="0"/>
-        </w:rPr>
-      </w:r>
-    </w:p>
-    <w:p>
-      <w:pPr>
-        <w:spacing w:after="0" w:line="240" w:lineRule="auto"/>
-        <w:jc w:val="both"/>
-        <w:rPr>
-          <w:rFonts w:ascii="Calibri" w:cs="Calibri" w:eastAsia="Calibri" w:hAnsi="Calibri"/>
-          <w:b w:val="1"/>
-          <w:bCs w:val="1"/>
-          <w:color w:val="000000"/>
-          <w:sz w:val="20"/>
-          <w:szCs w:val="20"/>
-        </w:rPr>
-      </w:pPr>
-      <w:r>
-        <w:rPr>
-          <w:rtl w:val="0"/>
-        </w:rPr>
-      </w:r>
-    </w:p>
-    <w:p>
-      <w:pPr>
-        <w:spacing w:after="0" w:line="240" w:lineRule="auto"/>
-        <w:jc w:val="both"/>
-        <w:rPr>
-          <w:rFonts w:ascii="Calibri" w:cs="Calibri" w:eastAsia="Calibri" w:hAnsi="Calibri"/>
-          <w:b w:val="1"/>
-          <w:bCs w:val="1"/>
-          <w:color w:val="000000"/>
-          <w:sz w:val="20"/>
-          <w:szCs w:val="20"/>
-        </w:rPr>
-      </w:pPr>
-      <w:r>
-        <w:rPr>
-          <w:rtl w:val="0"/>
-        </w:rPr>
-      </w:r>
-    </w:p>
-    <w:p>
-      <w:pPr>
-        <w:spacing w:after="0" w:line="240" w:lineRule="auto"/>
-        <w:jc w:val="both"/>
-        <w:rPr>
-          <w:rFonts w:ascii="Calibri" w:cs="Calibri" w:eastAsia="Calibri" w:hAnsi="Calibri"/>
-          <w:b w:val="1"/>
-          <w:bCs w:val="1"/>
-          <w:color w:val="000000"/>
-          <w:sz w:val="20"/>
-          <w:szCs w:val="20"/>
-        </w:rPr>
-      </w:pPr>
-      <w:r>
-        <w:rPr>
-          <w:rtl w:val="0"/>
-        </w:rPr>
-      </w:r>
-    </w:p>
-    <w:p>
-      <w:pPr>
-        <w:spacing w:after="0" w:line="240" w:lineRule="auto"/>
-        <w:jc w:val="both"/>
-        <w:rPr>
-          <w:rFonts w:ascii="Calibri" w:cs="Calibri" w:eastAsia="Calibri" w:hAnsi="Calibri"/>
-          <w:b w:val="1"/>
-          <w:bCs w:val="1"/>
-          <w:color w:val="000000"/>
-          <w:sz w:val="20"/>
-          <w:szCs w:val="20"/>
-        </w:rPr>
-      </w:pPr>
-      <w:r>
-        <w:rPr>
-          <w:rtl w:val="0"/>
-        </w:rPr>
-      </w:r>
-    </w:p>
-    <w:p>
-      <w:pPr>
-        <w:spacing w:after="0" w:line="240" w:lineRule="auto"/>
-        <w:jc w:val="both"/>
-        <w:rPr>
-          <w:rFonts w:ascii="Calibri" w:cs="Calibri" w:eastAsia="Calibri" w:hAnsi="Calibri"/>
-          <w:b w:val="1"/>
-          <w:bCs w:val="1"/>
-          <w:color w:val="000000"/>
-          <w:sz w:val="20"/>
-          <w:szCs w:val="20"/>
-        </w:rPr>
-      </w:pPr>
-      <w:r>
-        <w:rPr>
-          <w:rtl w:val="0"/>
-        </w:rPr>
-      </w:r>
-    </w:p>
-    <w:p>
-      <w:pPr>
-        <w:spacing w:after="0" w:line="240" w:lineRule="auto"/>
-        <w:jc w:val="both"/>
-        <w:rPr>
-          <w:rFonts w:ascii="Calibri" w:cs="Calibri" w:eastAsia="Calibri" w:hAnsi="Calibri"/>
-          <w:b w:val="1"/>
-          <w:bCs w:val="1"/>
-          <w:color w:val="000000"/>
-          <w:sz w:val="20"/>
-          <w:szCs w:val="20"/>
-        </w:rPr>
-      </w:pPr>
-      <w:r>
-        <w:rPr>
-          <w:rtl w:val="0"/>
-        </w:rPr>
-      </w:r>
-    </w:p>
-    <w:p>
-      <w:pPr>
-        <w:spacing w:after="0" w:line="240" w:lineRule="auto"/>
-        <w:jc w:val="both"/>
-        <w:rPr>
-          <w:rFonts w:ascii="Calibri" w:cs="Calibri" w:eastAsia="Calibri" w:hAnsi="Calibri"/>
-          <w:b w:val="1"/>
-          <w:bCs w:val="1"/>
-          <w:color w:val="000000"/>
-          <w:sz w:val="20"/>
-          <w:szCs w:val="20"/>
-        </w:rPr>
-      </w:pPr>
-      <w:r>
-        <w:rPr>
-          <w:rtl w:val="0"/>
-        </w:rPr>
-      </w:r>
-    </w:p>
-    <w:p>
-      <w:pPr>
-        <w:spacing w:after="0" w:line="240" w:lineRule="auto"/>
-        <w:jc w:val="both"/>
-        <w:rPr>
-          <w:rFonts w:ascii="Calibri" w:cs="Calibri" w:eastAsia="Calibri" w:hAnsi="Calibri"/>
-          <w:b w:val="1"/>
-          <w:bCs w:val="1"/>
-          <w:color w:val="000000"/>
-          <w:sz w:val="20"/>
-          <w:szCs w:val="20"/>
-        </w:rPr>
-      </w:pPr>
-      <w:r>
-        <w:rPr>
-          <w:rtl w:val="0"/>
-        </w:rPr>
-      </w:r>
-    </w:p>
-    <w:p>
-      <w:pPr>
-        <w:spacing w:after="0" w:line="240" w:lineRule="auto"/>
-        <w:jc w:val="both"/>
-        <w:rPr>
-          <w:rFonts w:ascii="Calibri" w:cs="Calibri" w:eastAsia="Calibri" w:hAnsi="Calibri"/>
-          <w:b w:val="1"/>
-          <w:bCs w:val="1"/>
-          <w:color w:val="000000"/>
-          <w:sz w:val="20"/>
-          <w:szCs w:val="20"/>
-        </w:rPr>
-      </w:pPr>
-      <w:r>
-        <w:rPr>
-          <w:rtl w:val="0"/>
-        </w:rPr>
-      </w:r>
-    </w:p>
-    <w:p>
-      <w:pPr>
-        <w:spacing w:after="0" w:line="240" w:lineRule="auto"/>
-        <w:jc w:val="both"/>
-        <w:rPr>
-          <w:rFonts w:ascii="Calibri" w:cs="Calibri" w:eastAsia="Calibri" w:hAnsi="Calibri"/>
-          <w:b w:val="1"/>
-          <w:bCs w:val="1"/>
-          <w:color w:val="000000"/>
-          <w:sz w:val="20"/>
-          <w:szCs w:val="20"/>
-        </w:rPr>
-      </w:pPr>
-      <w:r>
-        <w:rPr>
-          <w:rtl w:val="0"/>
-        </w:rPr>
-      </w:r>
-    </w:p>
-    <w:p>
-      <w:pPr>
-        <w:spacing w:after="0" w:line="240" w:lineRule="auto"/>
-        <w:jc w:val="both"/>
-        <w:rPr>
-          <w:rFonts w:ascii="Calibri" w:cs="Calibri" w:eastAsia="Calibri" w:hAnsi="Calibri"/>
-          <w:b w:val="1"/>
-          <w:bCs w:val="1"/>
-          <w:color w:val="000000"/>
-          <w:sz w:val="20"/>
-          <w:szCs w:val="20"/>
-        </w:rPr>
-      </w:pPr>
-      <w:r>
-        <w:rPr>
-          <w:rtl w:val="0"/>
-        </w:rPr>
-      </w:r>
-    </w:p>
-    <w:p>
-      <w:pPr>
-        <w:spacing w:after="0" w:line="240" w:lineRule="auto"/>
-        <w:jc w:val="both"/>
-        <w:rPr>
-          <w:rFonts w:ascii="Calibri" w:cs="Calibri" w:eastAsia="Calibri" w:hAnsi="Calibri"/>
-          <w:b w:val="1"/>
-          <w:bCs w:val="1"/>
-          <w:color w:val="000000"/>
-          <w:sz w:val="20"/>
-          <w:szCs w:val="20"/>
-        </w:rPr>
-      </w:pPr>
-      <w:r>
-        <w:rPr>
-          <w:rtl w:val="0"/>
-        </w:rPr>
-      </w:r>
-    </w:p>
-    <w:p>
-      <w:pPr>
-        <w:spacing w:after="0" w:line="240" w:lineRule="auto"/>
-        <w:jc w:val="both"/>
-        <w:rPr>
-          <w:rFonts w:ascii="Calibri" w:cs="Calibri" w:eastAsia="Calibri" w:hAnsi="Calibri"/>
-          <w:b w:val="1"/>
-          <w:bCs w:val="1"/>
-          <w:color w:val="000000"/>
-          <w:sz w:val="20"/>
-          <w:szCs w:val="20"/>
-        </w:rPr>
-      </w:pPr>
-      <w:r>
-        <w:rPr>
-          <w:rtl w:val="0"/>
-        </w:rPr>
-      </w:r>
-    </w:p>
-    <w:p>
-      <w:pPr>
-        <w:spacing w:after="0" w:line="240" w:lineRule="auto"/>
-        <w:jc w:val="both"/>
-        <w:rPr>
-          <w:rFonts w:ascii="Calibri" w:cs="Calibri" w:eastAsia="Calibri" w:hAnsi="Calibri"/>
-          <w:b w:val="1"/>
-          <w:bCs w:val="1"/>
-          <w:color w:val="000000"/>
-          <w:sz w:val="20"/>
-          <w:szCs w:val="20"/>
-        </w:rPr>
-      </w:pPr>
-      <w:r>
-        <w:rPr>
-          <w:rtl w:val="0"/>
-        </w:rPr>
-      </w:r>
-    </w:p>
-    <w:p>
-      <w:pPr>
-        <w:spacing w:after="0" w:line="240" w:lineRule="auto"/>
-        <w:jc w:val="both"/>
-        <w:rPr>
-          <w:rFonts w:ascii="Calibri" w:cs="Calibri" w:eastAsia="Calibri" w:hAnsi="Calibri"/>
-          <w:b w:val="1"/>
-          <w:bCs w:val="1"/>
-          <w:color w:val="000000"/>
-          <w:sz w:val="20"/>
-          <w:szCs w:val="20"/>
-        </w:rPr>
-      </w:pPr>
-      <w:r>
-        <w:rPr>
-          <w:rtl w:val="0"/>
-        </w:rPr>
-      </w:r>
-    </w:p>
-    <w:p>
-      <w:pPr>
-        <w:spacing w:after="0" w:line="240" w:lineRule="auto"/>
-        <w:jc w:val="both"/>
-        <w:rPr>
-          <w:rFonts w:ascii="Calibri" w:cs="Calibri" w:eastAsia="Calibri" w:hAnsi="Calibri"/>
-          <w:b w:val="1"/>
-          <w:bCs w:val="1"/>
-          <w:color w:val="000000"/>
-          <w:sz w:val="20"/>
-          <w:szCs w:val="20"/>
-        </w:rPr>
-      </w:pPr>
-      <w:r>
-        <w:rPr>
-          <w:rtl w:val="0"/>
-        </w:rPr>
-      </w:r>
-    </w:p>
-    <w:p>
-      <w:pPr>
-        <w:spacing w:after="0" w:line="240" w:lineRule="auto"/>
-        <w:jc w:val="both"/>
-        <w:rPr>
-          <w:rFonts w:ascii="Calibri" w:cs="Calibri" w:eastAsia="Calibri" w:hAnsi="Calibri"/>
-          <w:color w:val="000000"/>
-          <w:sz w:val="20"/>
-          <w:szCs w:val="20"/>
-        </w:rPr>
-      </w:pPr>
-      <w:r>
-        <w:rPr>
-          <w:rtl w:val="0"/>
-        </w:rPr>
-      </w:r>
-    </w:p>
-    <w:p>
-      <w:pPr>
-        <w:spacing w:after="0" w:line="240" w:lineRule="auto"/>
-        <w:jc w:val="both"/>
-        <w:rPr>
-          <w:rFonts w:ascii="Calibri" w:cs="Calibri" w:eastAsia="Calibri" w:hAnsi="Calibri"/>
-          <w:color w:val="000000"/>
-          <w:sz w:val="20"/>
-          <w:szCs w:val="20"/>
-        </w:rPr>
-      </w:pPr>
-      <w:r>
-        <w:rPr>
-          <w:rtl w:val="0"/>
-        </w:rPr>
-      </w:r>
-    </w:p>
-    <w:p>
-      <w:pPr>
-        <w:spacing w:after="0" w:line="240" w:lineRule="auto"/>
-        <w:jc w:val="both"/>
-        <w:rPr>
-          <w:rFonts w:ascii="Calibri" w:cs="Calibri" w:eastAsia="Calibri" w:hAnsi="Calibri"/>
-          <w:color w:val="000000"/>
-          <w:sz w:val="20"/>
-          <w:szCs w:val="20"/>
-        </w:rPr>
-      </w:pPr>
-      <w:r>
-        <w:rPr>
-          <w:rtl w:val="0"/>
-        </w:rPr>
-      </w:r>
-    </w:p>
-    <w:p>
-      <w:pPr>
-        <w:spacing w:after="0" w:line="240" w:lineRule="auto"/>
-        <w:ind w:left="0" w:firstLine="0"/>
-        <w:jc w:val="left"/>
-        <w:rPr>
-          <w:sz w:val="20"/>
-          <w:szCs w:val="20"/>
-        </w:rPr>
-      </w:pPr>
-      <w:r>
-        <w:rPr>
-          <w:rtl w:val="0"/>
-        </w:rPr>
-      </w:r>
-    </w:p>
-    <w:p>
-      <w:pPr>
-        <w:spacing w:after="0" w:line="240" w:lineRule="auto"/>
-        <w:ind w:left="0" w:firstLine="0"/>
-        <w:jc w:val="left"/>
-        <w:rPr>
-          <w:sz w:val="20"/>
-          <w:szCs w:val="20"/>
-        </w:rPr>
-      </w:pPr>
-      <w:r>
-        <w:rPr>
-          <w:rtl w:val="0"/>
-        </w:rPr>
-      </w:r>
-    </w:p>
-    <w:p>
-      <w:pPr>
-        <w:spacing w:after="0" w:line="240" w:lineRule="auto"/>
-        <w:ind w:left="0" w:firstLine="0"/>
-        <w:jc w:val="left"/>
-        <w:rPr>
-          <w:sz w:val="20"/>
-          <w:szCs w:val="20"/>
-        </w:rPr>
-      </w:pPr>
-      <w:r>
-        <w:rPr>
-          <w:rtl w:val="0"/>
-        </w:rPr>
-      </w:r>
-    </w:p>
-    <w:p>
-      <w:pPr>
-        <w:spacing w:after="0" w:line="240" w:lineRule="auto"/>
-        <w:ind w:left="0" w:firstLine="0"/>
-        <w:jc w:val="left"/>
-        <w:rPr>
-          <w:sz w:val="20"/>
-          <w:szCs w:val="20"/>
-        </w:rPr>
-      </w:pPr>
-      <w:r>
-        <w:rPr>
-          <w:rtl w:val="0"/>
-        </w:rPr>
-      </w:r>
-    </w:p>
-    <w:p>
-      <w:pPr>
-        <w:spacing w:after="0" w:line="240" w:lineRule="auto"/>
-        <w:ind w:left="0" w:firstLine="0"/>
-        <w:jc w:val="left"/>
-        <w:rPr>
-          <w:sz w:val="20"/>
-          <w:szCs w:val="20"/>
-        </w:rPr>
-      </w:pPr>
-      <w:r>
-        <w:rPr>
-          <w:rtl w:val="0"/>
-        </w:rPr>
-      </w:r>
-    </w:p>
-    <w:p>
-      <w:pPr>
-        <w:spacing w:after="0" w:line="240" w:lineRule="auto"/>
-        <w:ind w:left="0" w:firstLine="0"/>
-        <w:jc w:val="left"/>
-        <w:rPr>
-          <w:sz w:val="20"/>
-          <w:szCs w:val="20"/>
-        </w:rPr>
-      </w:pPr>
-      <w:r>
-        <w:rPr>
-          <w:rtl w:val="0"/>
-        </w:rPr>
-      </w:r>
-    </w:p>
-    <w:p>
-      <w:pPr>
-        <w:spacing w:after="0" w:line="240" w:lineRule="auto"/>
-        <w:ind w:left="0" w:firstLine="0"/>
-        <w:jc w:val="left"/>
-        <w:rPr>
-          <w:sz w:val="20"/>
-          <w:szCs w:val="20"/>
-        </w:rPr>
-      </w:pPr>
-      <w:r>
-        <w:rPr>
-          <w:rtl w:val="0"/>
-        </w:rPr>
-      </w:r>
-    </w:p>
-    <w:p>
-      <w:pPr>
-        <w:spacing w:after="0" w:line="240" w:lineRule="auto"/>
-        <w:ind w:left="0" w:firstLine="0"/>
-        <w:jc w:val="left"/>
-        <w:rPr>
-          <w:sz w:val="20"/>
-          <w:szCs w:val="20"/>
-        </w:rPr>
-      </w:pPr>
-      <w:r>
-        <w:rPr>
-          <w:rtl w:val="0"/>
-        </w:rPr>
-      </w:r>
-    </w:p>
-    <w:p>
-      <w:pPr>
-        <w:spacing w:after="0" w:line="240" w:lineRule="auto"/>
-        <w:ind w:left="0" w:firstLine="0"/>
-        <w:jc w:val="left"/>
-        <w:rPr>
-          <w:sz w:val="20"/>
-          <w:szCs w:val="20"/>
-        </w:rPr>
-      </w:pPr>
-      <w:r>
-        <w:rPr>
-          <w:rtl w:val="0"/>
-        </w:rPr>
-      </w:r>
-    </w:p>
-    <w:p>
-      <w:pPr>
-        <w:spacing w:after="0" w:line="240" w:lineRule="auto"/>
-        <w:ind w:left="0" w:firstLine="0"/>
-        <w:jc w:val="left"/>
-        <w:rPr>
-          <w:sz w:val="20"/>
-          <w:szCs w:val="20"/>
-        </w:rPr>
-      </w:pPr>
-      <w:r>
-        <w:rPr>
-          <w:rtl w:val="0"/>
-        </w:rPr>
-      </w:r>
-    </w:p>
-    <w:p>
-      <w:pPr>
-        <w:spacing w:after="0" w:line="240" w:lineRule="auto"/>
-        <w:ind w:left="0" w:firstLine="0"/>
-        <w:jc w:val="left"/>
-        <w:rPr>
-          <w:sz w:val="16"/>
-          <w:szCs w:val="16"/>
-        </w:rPr>
-      </w:pPr>
-      <w:r>
-        <w:rPr>
-          <w:sz w:val="16"/>
-          <w:szCs w:val="16"/>
-          <w:rtl w:val="0"/>
-        </w:rPr>
-        <w:t xml:space="preserve">Dongemond Klimaattechniek B.V</w:t>
-      </w:r>
-      <w:r>
-        <w:rPr>
-          <w:color w:val="4d8cac"/>
-          <w:sz w:val="16"/>
-          <w:szCs w:val="16"/>
-          <w:rtl w:val="0"/>
-        </w:rPr>
-        <w:t xml:space="preserve">               </w:t>
-        <w:tab/>
-        <w:t xml:space="preserve">       </w:t>
-      </w:r>
-      <w:r>
-        <w:rPr>
-          <w:sz w:val="16"/>
-          <w:szCs w:val="16"/>
-          <w:rtl w:val="0"/>
-        </w:rPr>
-        <w:t xml:space="preserve">Telefoon:  0162-750861</w:t>
-      </w:r>
-      <w:r>
-        <w:rPr>
-          <w:color w:val="4d8cac"/>
-          <w:sz w:val="16"/>
-          <w:szCs w:val="16"/>
-          <w:rtl w:val="0"/>
-        </w:rPr>
-        <w:t xml:space="preserve">          </w:t>
-        <w:tab/>
-        <w:tab/>
-        <w:t xml:space="preserve">                                            </w:t>
-      </w:r>
-      <w:r>
-        <w:rPr>
-          <w:sz w:val="16"/>
-          <w:szCs w:val="16"/>
-          <w:rtl w:val="0"/>
-        </w:rPr>
-        <w:t xml:space="preserve">KvK: 71245340</w:t>
+      <w:r>
+        <w:br w:type="page"/>
       </w:r>
     </w:p>
     <w:p>

</xml_diff>

<commit_message>
Fix template page break: correct paragraph boundary detection
Previous fix corrupted XML by splitting mid-paragraph (used text
position instead of <w:p start). Restore from pre-fix state and
reapply with rfind('<w:p[ >]') to find the correct paragraph start.

Co-Authored-By: Claude Sonnet 4.6 <noreply@anthropic.com>
</commit_message>
<xml_diff>
--- a/templates/SJABLOON-DKT-AIRCO.docx
+++ b/templates/SJABLOON-DKT-AIRCO.docx
@@ -2047,6 +2047,64 @@
     <w:p>
       <w:r>
         <w:br w:type="page"/>
+      </w:r>
+    </w:p>
+    <w:p>
+      <w:pPr>
+        <w:spacing w:after="0" w:line="240" w:lineRule="auto"/>
+        <w:ind w:left="0" w:firstLine="0"/>
+        <w:jc w:val="left"/>
+        <w:rPr>
+          <w:sz w:val="16"/>
+          <w:szCs w:val="16"/>
+        </w:rPr>
+      </w:pPr>
+      <w:r>
+        <w:rPr>
+          <w:sz w:val="16"/>
+          <w:szCs w:val="16"/>
+          <w:rtl w:val="0"/>
+        </w:rPr>
+        <w:t xml:space="preserve">Dongemond Klimaattechniek B.V</w:t>
+      </w:r>
+      <w:r>
+        <w:rPr>
+          <w:color w:val="4d8cac"/>
+          <w:sz w:val="16"/>
+          <w:szCs w:val="16"/>
+          <w:rtl w:val="0"/>
+        </w:rPr>
+        <w:t xml:space="preserve">               </w:t>
+        <w:tab/>
+        <w:t xml:space="preserve">       </w:t>
+      </w:r>
+      <w:r>
+        <w:rPr>
+          <w:sz w:val="16"/>
+          <w:szCs w:val="16"/>
+          <w:rtl w:val="0"/>
+        </w:rPr>
+        <w:t xml:space="preserve">Telefoon:  0162-750861</w:t>
+      </w:r>
+      <w:r>
+        <w:rPr>
+          <w:color w:val="4d8cac"/>
+          <w:sz w:val="16"/>
+          <w:szCs w:val="16"/>
+          <w:rtl w:val="0"/>
+        </w:rPr>
+        <w:t xml:space="preserve">          </w:t>
+        <w:tab/>
+        <w:tab/>
+        <w:t xml:space="preserve">                                            </w:t>
+      </w:r>
+      <w:r>
+        <w:rPr>
+          <w:sz w:val="16"/>
+          <w:szCs w:val="16"/>
+          <w:rtl w:val="0"/>
+        </w:rPr>
+        <w:t xml:space="preserve">KvK: 71245340</w:t>
       </w:r>
     </w:p>
     <w:p>

</xml_diff>

<commit_message>
Add background logo to header so it appears on every page
Logo was only placed as body anchors on specific pages, missing
from the Uitgangspunten page. Moving it to the Word header ensures
it repeats automatically on all pages for both templates.

Co-Authored-By: Claude Sonnet 4.6 <noreply@anthropic.com>
</commit_message>
<xml_diff>
--- a/templates/SJABLOON-DKT-AIRCO.docx
+++ b/templates/SJABLOON-DKT-AIRCO.docx
@@ -5015,6 +5015,53 @@
       <w:rPr>
         <w:rtl w:val="0"/>
       </w:rPr>
+    </w:r>
+  </w:p>
+  <w:p>
+    <w:pPr>
+      <w:spacing w:after="0"/>
+    </w:pPr>
+    <w:r>
+      <w:drawing>
+        <wp:anchor xmlns:wp="http://schemas.openxmlformats.org/drawingml/2006/wordprocessingDrawing" allowOverlap="1" behindDoc="1" distB="0" distT="0" distL="0" distR="0" hidden="0" layoutInCell="1" locked="0" relativeHeight="0" simplePos="0">
+          <wp:simplePos x="0" y="0"/>
+          <wp:positionH relativeFrom="page">
+            <wp:posOffset>972000</wp:posOffset>
+          </wp:positionH>
+          <wp:positionV relativeFrom="page">
+            <wp:posOffset>3420000</wp:posOffset>
+          </wp:positionV>
+          <wp:extent cx="5791200" cy="5791200"/>
+          <wp:effectExtent b="0" l="0" r="0" t="0"/>
+          <wp:wrapNone/>
+          <wp:docPr id="901" name="bg-logo-header"/>
+          <a:graphic xmlns:a="http://schemas.openxmlformats.org/drawingml/2006/main">
+            <a:graphicData uri="http://schemas.openxmlformats.org/drawingml/2006/picture">
+              <pic:pic xmlns:pic="http://schemas.openxmlformats.org/drawingml/2006/picture">
+                <pic:nvPicPr>
+                  <pic:cNvPr id="0" name="bg-logo-header"/>
+                  <pic:cNvPicPr preferRelativeResize="0"/>
+                </pic:nvPicPr>
+                <pic:blipFill>
+                  <a:blip xmlns:r="http://schemas.openxmlformats.org/officeDocument/2006/relationships" r:embed="rIdBgLogo"/>
+                  <a:srcRect b="0" l="0" r="0" t="0"/>
+                  <a:stretch>
+                    <a:fillRect/>
+                  </a:stretch>
+                </pic:blipFill>
+                <pic:spPr>
+                  <a:xfrm>
+                    <a:off x="0" y="0"/>
+                    <a:ext cx="5791200" cy="5791200"/>
+                  </a:xfrm>
+                  <a:prstGeom prst="rect"/>
+                  <a:ln/>
+                </pic:spPr>
+              </pic:pic>
+            </a:graphicData>
+          </a:graphic>
+        </wp:anchor>
+      </w:drawing>
     </w:r>
   </w:p>
 </w:hdr>

</xml_diff>

<commit_message>
Remove duplicate company info before Levertijd in both templates
Company info (Dongemond header) appeared at top of page 2 before
Levertijd. Should only appear on page 1. Removed the 3 paragraphs
so Levertijd now starts cleanly at the top of its page.

Co-Authored-By: Claude Sonnet 4.6 <noreply@anthropic.com>
</commit_message>
<xml_diff>
--- a/templates/SJABLOON-DKT-AIRCO.docx
+++ b/templates/SJABLOON-DKT-AIRCO.docx
@@ -2047,163 +2047,6 @@
     <w:p>
       <w:r>
         <w:br w:type="page"/>
-      </w:r>
-    </w:p>
-    <w:p>
-      <w:pPr>
-        <w:spacing w:after="0" w:line="240" w:lineRule="auto"/>
-        <w:ind w:left="0" w:firstLine="0"/>
-        <w:jc w:val="left"/>
-        <w:rPr>
-          <w:sz w:val="16"/>
-          <w:szCs w:val="16"/>
-        </w:rPr>
-      </w:pPr>
-      <w:r>
-        <w:rPr>
-          <w:sz w:val="16"/>
-          <w:szCs w:val="16"/>
-          <w:rtl w:val="0"/>
-        </w:rPr>
-        <w:t xml:space="preserve">Dongemond Klimaattechniek B.V</w:t>
-      </w:r>
-      <w:r>
-        <w:rPr>
-          <w:color w:val="4d8cac"/>
-          <w:sz w:val="16"/>
-          <w:szCs w:val="16"/>
-          <w:rtl w:val="0"/>
-        </w:rPr>
-        <w:t xml:space="preserve">               </w:t>
-        <w:tab/>
-        <w:t xml:space="preserve">       </w:t>
-      </w:r>
-      <w:r>
-        <w:rPr>
-          <w:sz w:val="16"/>
-          <w:szCs w:val="16"/>
-          <w:rtl w:val="0"/>
-        </w:rPr>
-        <w:t xml:space="preserve">Telefoon:  0162-750861</w:t>
-      </w:r>
-      <w:r>
-        <w:rPr>
-          <w:color w:val="4d8cac"/>
-          <w:sz w:val="16"/>
-          <w:szCs w:val="16"/>
-          <w:rtl w:val="0"/>
-        </w:rPr>
-        <w:t xml:space="preserve">          </w:t>
-        <w:tab/>
-        <w:tab/>
-        <w:t xml:space="preserve">                                            </w:t>
-      </w:r>
-      <w:r>
-        <w:rPr>
-          <w:sz w:val="16"/>
-          <w:szCs w:val="16"/>
-          <w:rtl w:val="0"/>
-        </w:rPr>
-        <w:t xml:space="preserve">KvK: 71245340</w:t>
-      </w:r>
-    </w:p>
-    <w:p>
-      <w:pPr>
-        <w:tabs>
-          <w:tab w:val="left" w:leader="none" w:pos="3285"/>
-        </w:tabs>
-        <w:spacing w:after="0" w:line="240" w:lineRule="auto"/>
-        <w:rPr>
-          <w:color w:val="1a1915"/>
-          <w:sz w:val="16"/>
-          <w:szCs w:val="16"/>
-        </w:rPr>
-      </w:pPr>
-      <w:r>
-        <w:rPr>
-          <w:sz w:val="16"/>
-          <w:szCs w:val="16"/>
-          <w:rtl w:val="0"/>
-        </w:rPr>
-        <w:t xml:space="preserve">Benedenkerkstraat 57                                               Email: </w:t>
-      </w:r>
-      <w:hyperlink r:id="rId13">
-        <w:r>
-          <w:rPr>
-            <w:sz w:val="16"/>
-            <w:szCs w:val="16"/>
-            <w:u w:val="single"/>
-            <w:rtl w:val="0"/>
-          </w:rPr>
-          <w:t xml:space="preserve">info@dongemondklimaattechniek.nl</w:t>
-        </w:r>
-      </w:hyperlink>
-      <w:r>
-        <w:rPr>
-          <w:sz w:val="16"/>
-          <w:szCs w:val="16"/>
-          <w:rtl w:val="0"/>
-        </w:rPr>
-        <w:t xml:space="preserve">                                       BtwNr: NL858635471B01</w:t>
-      </w:r>
-      <w:r>
-        <w:rPr>
-          <w:rtl w:val="0"/>
-        </w:rPr>
-      </w:r>
-    </w:p>
-    <w:p>
-      <w:pPr>
-        <w:spacing w:after="0" w:line="240" w:lineRule="auto"/>
-        <w:rPr>
-          <w:sz w:val="16"/>
-          <w:szCs w:val="16"/>
-        </w:rPr>
-      </w:pPr>
-      <w:bookmarkStart w:colFirst="0" w:colLast="0" w:name="_szqe08wi9zvs" w:id="1"/>
-      <w:bookmarkEnd w:id="1"/>
-      <w:r>
-        <w:rPr>
-          <w:sz w:val="16"/>
-          <w:szCs w:val="16"/>
-          <w:rtl w:val="0"/>
-        </w:rPr>
-        <w:t xml:space="preserve">5165 CA Waspik                 </w:t>
-      </w:r>
-      <w:r>
-        <w:rPr>
-          <w:color w:val="4d8cac"/>
-          <w:sz w:val="16"/>
-          <w:szCs w:val="16"/>
-          <w:rtl w:val="0"/>
-        </w:rPr>
-        <w:tab/>
-        <w:tab/>
-      </w:r>
-      <w:r>
-        <w:rPr>
-          <w:sz w:val="16"/>
-          <w:szCs w:val="16"/>
-          <w:rtl w:val="0"/>
-        </w:rPr>
-        <w:t xml:space="preserve">       Website: www.dongemondklimaattechniek.nl </w:t>
-      </w:r>
-      <w:r>
-        <w:rPr>
-          <w:color w:val="4d8cac"/>
-          <w:sz w:val="16"/>
-          <w:szCs w:val="16"/>
-          <w:rtl w:val="0"/>
-        </w:rPr>
-        <w:tab/>
-      </w:r>
-      <w:r>
-        <w:rPr>
-          <w:sz w:val="16"/>
-          <w:szCs w:val="16"/>
-          <w:rtl w:val="0"/>
-        </w:rPr>
-        <w:t xml:space="preserve">                        IBAN: NL07RABO0329224719</w:t>
       </w:r>
     </w:p>
     <w:p>

</xml_diff>

<commit_message>
Programmatic spec bullets, klantadres, and unit photos in offerte
- buildACSpecification() en buildWPSpecification(): volledig programmatische
  bullet points vervangen AI-narratief; geen verboden zinnen meer mogelijk
- AI-prompt ingekort tot meta-velden only (offertezin + aanhef)
- Klantadres ({klantadres} + {klantpostcodeplaats}) toegevoegd aan beide sjablonen
- Afbeeldingen geëxtraheerd uit Foto's airconditioning.docx naar templates/images/
- docxtemplater-image-module-free geïnstalleerd; {%offerteImage} in AIRCO-sjabloon
- getOfferteImageBuffer() bepaalt correct afbeelding op basis van daikinType

Co-Authored-By: Claude Sonnet 4.6 <noreply@anthropic.com>
</commit_message>
<xml_diff>
--- a/templates/SJABLOON-DKT-AIRCO.docx
+++ b/templates/SJABLOON-DKT-AIRCO.docx
@@ -408,8 +408,11 @@
       </w:pPr>
       <w:r>
         <w:rPr>
-          <w:rtl w:val="0"/>
-        </w:rPr>
+          <w:sz w:val="20"/>
+          <w:szCs w:val="20"/>
+          <w:rtl w:val="0"/>
+        </w:rPr>
+        <w:t>{klantadres}</w:t>
       </w:r>
     </w:p>
     <w:p>
@@ -447,8 +450,11 @@
       </w:pPr>
       <w:r>
         <w:rPr>
-          <w:rtl w:val="0"/>
-        </w:rPr>
+          <w:sz w:val="20"/>
+          <w:szCs w:val="20"/>
+          <w:rtl w:val="0"/>
+        </w:rPr>
+        <w:t>{klantpostcodeplaats}</w:t>
       </w:r>
     </w:p>
     <w:p>
@@ -2042,6 +2048,11 @@
         <w:rPr>
           <w:rtl w:val="0"/>
         </w:rPr>
+      </w:r>
+    </w:p>
+    <w:p>
+      <w:r>
+        <w:t>{%offerteImage}</w:t>
       </w:r>
     </w:p>
     <w:p>

</xml_diff>

<commit_message>
Voeg optielabel toe boven afbeelding in offerte (Optie 1.1 – Woonkamer)
- getFirstEnabledACOption() extraheert eerste ingeschakelde optie + g/s index
- getOfferteImageLabel() bouwt label: "Optie 1.1 – [locatie]"
- {offerteImageLabel} placeholder (vet, 11pt) toegevoegd aan AIRCO-sjabloon
  boven {%offerteImage}
- Fix: getOfferteImagePath() gebruikte options.subOptions (bestaat niet);
  nu correct options["1"]["1"] structuur via getFirstEnabledACOption()

Co-Authored-By: Claude Sonnet 4.6 <noreply@anthropic.com>
</commit_message>
<xml_diff>
--- a/templates/SJABLOON-DKT-AIRCO.docx
+++ b/templates/SJABLOON-DKT-AIRCO.docx
@@ -2048,6 +2048,20 @@
         <w:rPr>
           <w:rtl w:val="0"/>
         </w:rPr>
+      </w:r>
+    </w:p>
+    <w:p>
+      <w:pPr>
+        <w:spacing w:after="60" w:before="120"/>
+      </w:pPr>
+      <w:r>
+        <w:rPr>
+          <w:rFonts w:ascii="Calibri" w:hAnsi="Calibri"/>
+          <w:b/>
+          <w:sz w:val="22"/>
+          <w:szCs w:val="22"/>
+        </w:rPr>
+        <w:t>{offerteImageLabel}</w:t>
       </w:r>
     </w:p>
     <w:p>

</xml_diff>

<commit_message>
Alle afbeeldingen per optie, kleiner en links uitgelijnd
- buildACImages() itereert alle enabled opties en geeft array terug
  met { offerteImageLabel, offerteImage } per optie
- Template gebruikt nu {#acImages}...{/acImages} loop zodat elke
  ingeschakelde optie zijn eigen label + afbeelding krijgt
- Afbeeldingen verkleind: 400x300 → 200x150 pixels
- centered: true → false (links uitgelijnd)
- resolveACImageName() fix: MS-detectie gebruikt /^MS\d/ regex
  zodat "RXM" niet meer als MS wordt herkend

Co-Authored-By: Claude Sonnet 4.6 <noreply@anthropic.com>
</commit_message>
<xml_diff>
--- a/templates/SJABLOON-DKT-AIRCO.docx
+++ b/templates/SJABLOON-DKT-AIRCO.docx
@@ -2051,6 +2051,11 @@
       </w:r>
     </w:p>
     <w:p>
+      <w:r>
+        <w:t>{#acImages}</w:t>
+      </w:r>
+    </w:p>
+    <w:p>
       <w:pPr>
         <w:spacing w:after="60" w:before="120"/>
       </w:pPr>
@@ -2067,6 +2072,11 @@
     <w:p>
       <w:r>
         <w:t>{%offerteImage}</w:t>
+      </w:r>
+    </w:p>
+    <w:p>
+      <w:r>
+        <w:t>{/acImages}</w:t>
       </w:r>
     </w:p>
     <w:p>

</xml_diff>

<commit_message>
Toon binnendeel + buitendeel afbeelding per optie
- resolveIndoorImageName(): binnendeel op basis van daikinType + kleur
- resolveOutdoorImageName(): buitendeel (MS, Evolar of split)
- buildACImages() geeft per optie beide paden terug als
  { offerteImage, offerteImageOutdoor }
- Sjabloon-loop uitgebreid met {%offerteImageOutdoor} na {%offerteImage}

Co-Authored-By: Claude Sonnet 4.6 <noreply@anthropic.com>
</commit_message>
<xml_diff>
--- a/templates/SJABLOON-DKT-AIRCO.docx
+++ b/templates/SJABLOON-DKT-AIRCO.docx
@@ -2072,6 +2072,11 @@
     <w:p>
       <w:r>
         <w:t>{%offerteImage}</w:t>
+      </w:r>
+    </w:p>
+    <w:p>
+      <w:r>
+        <w:t>{%offerteImageOutdoor}</w:t>
       </w:r>
     </w:p>
     <w:p>

</xml_diff>

<commit_message>
Verwijder harde pagina-einde; doorhaalstreep niet-geselecteerde gootkleuren
- Harde page break na afbeeldingssectie verwijderd zodat Levertijd en
  verdere inhoud bij meerdere opties gewoon doorschuift
- buildACSpecification: Unicode doorhaalstreep (U+0336) toegepast op
  de twee niet-geselecteerde gootkleuren wanneer gutterColor is ingevuld
  (bijv. Zwart geselecteerd → Wit en Crème doorgehaald)

Co-Authored-By: Claude Sonnet 4.6 <noreply@anthropic.com>
</commit_message>
<xml_diff>
--- a/templates/SJABLOON-DKT-AIRCO.docx
+++ b/templates/SJABLOON-DKT-AIRCO.docx
@@ -2082,11 +2082,6 @@
     <w:p>
       <w:r>
         <w:t>{/acImages}</w:t>
-      </w:r>
-    </w:p>
-    <w:p>
-      <w:r>
-        <w:br w:type="page"/>
       </w:r>
     </w:p>
     <w:p>

</xml_diff>

<commit_message>
Spec + afbeeldingen per optie geïntegreerd in één loop
- Template herschreven: {#acOptions}{optieSpec}{offerteImageLabel}
  {%offerteImage}{%offerteImageOutdoor}{/acOptions}{acClosing}
- buildACOptionSpec(): spec voor één optie (geen loop meer)
- buildACOptions(): combineert spec + afbeeldingspaden per optie
- AC_CLOSING: STEK/R32 verbatim na alle opties
- generateOfferteDoc: acOptions + acClosing doorgegeven aan template

Co-Authored-By: Claude Sonnet 4.6 <noreply@anthropic.com>
</commit_message>
<xml_diff>
--- a/templates/SJABLOON-DKT-AIRCO.docx
+++ b/templates/SJABLOON-DKT-AIRCO.docx
@@ -2017,6 +2017,11 @@
       </w:r>
     </w:p>
     <w:p>
+      <w:r>
+        <w:t>{#acOptions}</w:t>
+      </w:r>
+    </w:p>
+    <w:p>
       <w:pPr>
         <w:spacing w:after="0" w:line="240" w:lineRule="auto"/>
         <w:jc w:val="both"/>
@@ -2031,28 +2036,8 @@
           <w:color w:val="000000"/>
           <w:sz w:val="20"/>
           <w:szCs w:val="20"/>
-          <w:rtl w:val="0"/>
-        </w:rPr>
-        <w:t xml:space="preserve">{</w:t>
-      </w:r>
-      <w:r>
-        <w:rPr>
-          <w:rFonts w:ascii="Calibri" w:cs="Calibri" w:eastAsia="Calibri" w:hAnsi="Calibri"/>
-          <w:sz w:val="20"/>
-          <w:szCs w:val="20"/>
-          <w:rtl w:val="0"/>
-        </w:rPr>
-        <w:t xml:space="preserve">Specificatieinstallatie&amp;uitgangspunten}</w:t>
-      </w:r>
-      <w:r>
-        <w:rPr>
-          <w:rtl w:val="0"/>
-        </w:rPr>
-      </w:r>
-    </w:p>
-    <w:p>
-      <w:r>
-        <w:t>{#acImages}</w:t>
+        </w:rPr>
+        <w:t>{optieSpec}</w:t>
       </w:r>
     </w:p>
     <w:p>
@@ -2081,7 +2066,26 @@
     </w:p>
     <w:p>
       <w:r>
-        <w:t>{/acImages}</w:t>
+        <w:t>{/acOptions}</w:t>
+      </w:r>
+    </w:p>
+    <w:p>
+      <w:pPr>
+        <w:spacing w:after="0" w:line="240" w:lineRule="auto"/>
+        <w:jc w:val="both"/>
+        <w:rPr>
+          <w:sz w:val="20"/>
+          <w:szCs w:val="20"/>
+        </w:rPr>
+      </w:pPr>
+      <w:r>
+        <w:rPr>
+          <w:rFonts w:ascii="Calibri" w:cs="Calibri" w:eastAsia="Calibri" w:hAnsi="Calibri"/>
+          <w:color w:val="000000"/>
+          <w:sz w:val="20"/>
+          <w:szCs w:val="20"/>
+        </w:rPr>
+        <w:t>{acClosing}</w:t>
       </w:r>
     </w:p>
     <w:p>

</xml_diff>

<commit_message>
Bugfixes ronde 2: logo, footer, paginastructuur airco offerte
- Logo 'Lid van Techniek Nederland': verplaatst naar eerste paragraaf met pagina-relatieve positionering (altijd rechtsboven, niet langer afhankelijk van klantadres-paragraaf). Klantadres spacing verlaagd van 1440 naar 280 twips.
- Footer vereenvoudigd: mc:AlternateContent grijze lijn vervangen door eenvoudige w:pBdr border (betrouwbaarder in Word footer context)
- Paginastructuur: page break toegevoegd vóór {#acOptions} zodat elke optie op eigen pagina begint
- Page break vóór Levertijd-paragraaf toegevoegd
- Afbeeldingen: proportionele schaling op vaste hoogte (170px) i.p.v. vaste 200x150

Co-Authored-By: Claude Sonnet 4.6 <noreply@anthropic.com>
</commit_message>
<xml_diff>
--- a/templates/SJABLOON-DKT-AIRCO.docx
+++ b/templates/SJABLOON-DKT-AIRCO.docx
@@ -96,6 +96,48 @@
           </wp:anchor>
         </w:drawing>
       </w:r>
+      <w:r>
+        <w:drawing>
+          <wp:anchor allowOverlap="1" behindDoc="0" distB="0" distT="0" distL="0" distR="0" hidden="0" layoutInCell="1" locked="0" relativeHeight="0" simplePos="0">
+            <wp:simplePos x="0" y="0"/>
+            <wp:positionH relativeFrom="page">
+              <wp:posOffset>5370000</wp:posOffset>
+            </wp:positionH>
+            <wp:positionV relativeFrom="page">
+              <wp:posOffset>800000</wp:posOffset>
+            </wp:positionV>
+            <wp:extent cx="1491615" cy="511810"/>
+            <wp:effectExtent b="0" l="0" r="0" t="0"/>
+            <wp:wrapNone/>
+            <wp:docPr id="4" name="image5.png"/>
+            <a:graphic>
+              <a:graphicData uri="http://schemas.openxmlformats.org/drawingml/2006/picture">
+                <pic:pic>
+                  <pic:nvPicPr>
+                    <pic:cNvPr id="0" name="image5.png"/>
+                    <pic:cNvPicPr preferRelativeResize="0"/>
+                  </pic:nvPicPr>
+                  <pic:blipFill>
+                    <a:blip r:embed="rId8"/>
+                    <a:srcRect b="0" l="0" r="0" t="0"/>
+                    <a:stretch>
+                      <a:fillRect/>
+                    </a:stretch>
+                  </pic:blipFill>
+                  <pic:spPr>
+                    <a:xfrm>
+                      <a:off x="0" y="0"/>
+                      <a:ext cx="1491615" cy="511810"/>
+                    </a:xfrm>
+                    <a:prstGeom prst="rect"/>
+                    <a:ln/>
+                  </pic:spPr>
+                </pic:pic>
+              </a:graphicData>
+            </a:graphic>
+          </wp:anchor>
+        </w:drawing>
+      </w:r>
     </w:p>
     <w:p>
       <w:pPr>
@@ -387,7 +429,7 @@
           <w:between w:space="0" w:sz="0" w:val="nil"/>
         </w:pBdr>
         <w:shd w:fill="auto" w:val="clear"/>
-        <w:spacing w:after="0" w:before="1440" w:line="240" w:lineRule="auto"/>
+        <w:spacing w:after="0" w:before="280" w:line="240" w:lineRule="auto"/>
         <w:ind w:left="0" w:right="0" w:firstLine="0"/>
         <w:jc w:val="left"/>
         <w:rPr>
@@ -588,48 +630,6 @@
         <w:rPr>
           <w:rtl w:val="0"/>
         </w:rPr>
-      </w:r>
-      <w:r>
-        <w:drawing>
-          <wp:anchor allowOverlap="1" behindDoc="1" distB="0" distT="0" distL="0" distR="0" hidden="0" layoutInCell="1" locked="0" relativeHeight="0" simplePos="0">
-            <wp:simplePos x="0" y="0"/>
-            <wp:positionH relativeFrom="column">
-              <wp:posOffset>4465320</wp:posOffset>
-            </wp:positionH>
-            <wp:positionV relativeFrom="paragraph">
-              <wp:posOffset>34925</wp:posOffset>
-            </wp:positionV>
-            <wp:extent cx="1491615" cy="511810"/>
-            <wp:effectExtent b="0" l="0" r="0" t="0"/>
-            <wp:wrapNone/>
-            <wp:docPr id="4" name="image5.png"/>
-            <a:graphic>
-              <a:graphicData uri="http://schemas.openxmlformats.org/drawingml/2006/picture">
-                <pic:pic>
-                  <pic:nvPicPr>
-                    <pic:cNvPr id="0" name="image5.png"/>
-                    <pic:cNvPicPr preferRelativeResize="0"/>
-                  </pic:nvPicPr>
-                  <pic:blipFill>
-                    <a:blip r:embed="rId8"/>
-                    <a:srcRect b="0" l="0" r="0" t="0"/>
-                    <a:stretch>
-                      <a:fillRect/>
-                    </a:stretch>
-                  </pic:blipFill>
-                  <pic:spPr>
-                    <a:xfrm>
-                      <a:off x="0" y="0"/>
-                      <a:ext cx="1491615" cy="511810"/>
-                    </a:xfrm>
-                    <a:prstGeom prst="rect"/>
-                    <a:ln/>
-                  </pic:spPr>
-                </pic:pic>
-              </a:graphicData>
-            </a:graphic>
-          </wp:anchor>
-        </w:drawing>
       </w:r>
     </w:p>
     <w:p>
@@ -1352,595 +1352,8 @@
       </w:r>
     </w:p>
     <w:p>
-      <w:pPr>
-        <w:tabs>
-          <w:tab w:val="left" w:leader="none" w:pos="1276"/>
-          <w:tab w:val="left" w:leader="none" w:pos="3261"/>
-          <w:tab w:val="left" w:leader="none" w:pos="7230"/>
-        </w:tabs>
-        <w:spacing w:after="0" w:line="240" w:lineRule="auto"/>
-        <w:rPr>
-          <w:sz w:val="18"/>
-          <w:szCs w:val="18"/>
-        </w:rPr>
-      </w:pPr>
-      <w:r>
-        <w:rPr>
-          <w:rtl w:val="0"/>
-        </w:rPr>
-      </w:r>
-    </w:p>
-    <w:p>
-      <w:pPr>
-        <w:tabs>
-          <w:tab w:val="left" w:leader="none" w:pos="1276"/>
-          <w:tab w:val="left" w:leader="none" w:pos="3261"/>
-          <w:tab w:val="left" w:leader="none" w:pos="7230"/>
-        </w:tabs>
-        <w:spacing w:after="0" w:line="240" w:lineRule="auto"/>
-        <w:rPr>
-          <w:sz w:val="18"/>
-          <w:szCs w:val="18"/>
-        </w:rPr>
-      </w:pPr>
-      <w:r>
-        <w:rPr>
-          <w:rtl w:val="0"/>
-        </w:rPr>
-      </w:r>
-    </w:p>
-    <w:p>
-      <w:pPr>
-        <w:tabs>
-          <w:tab w:val="left" w:leader="none" w:pos="1276"/>
-          <w:tab w:val="left" w:leader="none" w:pos="3261"/>
-          <w:tab w:val="left" w:leader="none" w:pos="7230"/>
-        </w:tabs>
-        <w:spacing w:after="0" w:line="240" w:lineRule="auto"/>
-        <w:rPr>
-          <w:b w:val="1"/>
-          <w:bCs w:val="1"/>
-          <w:sz w:val="18"/>
-          <w:szCs w:val="18"/>
-          <w:u w:val="single"/>
-        </w:rPr>
-      </w:pPr>
-      <w:r>
-        <w:rPr>
-          <w:rtl w:val="0"/>
-        </w:rPr>
-      </w:r>
-    </w:p>
-    <w:p>
-      <w:pPr>
-        <w:spacing w:after="0" w:line="240" w:lineRule="auto"/>
-        <w:rPr>
-          <w:rFonts w:ascii="Calibri" w:cs="Calibri" w:eastAsia="Calibri" w:hAnsi="Calibri"/>
-          <w:sz w:val="20"/>
-          <w:szCs w:val="20"/>
-        </w:rPr>
-      </w:pPr>
-      <w:r>
-        <w:rPr>
-          <w:rtl w:val="0"/>
-        </w:rPr>
-      </w:r>
-    </w:p>
-    <w:p>
-      <w:pPr>
-        <w:tabs>
-          <w:tab w:val="left" w:leader="none" w:pos="1276"/>
-          <w:tab w:val="left" w:leader="none" w:pos="3261"/>
-          <w:tab w:val="left" w:leader="none" w:pos="7230"/>
-        </w:tabs>
-        <w:spacing w:after="0" w:line="240" w:lineRule="auto"/>
-        <w:rPr>
-          <w:sz w:val="16"/>
-          <w:szCs w:val="16"/>
-        </w:rPr>
-      </w:pPr>
-      <w:r>
-        <w:rPr>
-          <w:rtl w:val="0"/>
-        </w:rPr>
-      </w:r>
-    </w:p>
-    <w:p>
-      <w:pPr>
-        <w:tabs>
-          <w:tab w:val="left" w:leader="none" w:pos="1276"/>
-          <w:tab w:val="left" w:leader="none" w:pos="3261"/>
-          <w:tab w:val="left" w:leader="none" w:pos="7230"/>
-        </w:tabs>
-        <w:spacing w:after="0" w:line="240" w:lineRule="auto"/>
-        <w:rPr>
-          <w:sz w:val="16"/>
-          <w:szCs w:val="16"/>
-        </w:rPr>
-      </w:pPr>
-      <w:r>
-        <w:rPr>
-          <w:rtl w:val="0"/>
-        </w:rPr>
-      </w:r>
-    </w:p>
-    <w:p>
-      <w:pPr>
-        <w:tabs>
-          <w:tab w:val="left" w:leader="none" w:pos="1276"/>
-          <w:tab w:val="left" w:leader="none" w:pos="3261"/>
-          <w:tab w:val="left" w:leader="none" w:pos="7230"/>
-        </w:tabs>
-        <w:spacing w:after="0" w:line="240" w:lineRule="auto"/>
-        <w:rPr>
-          <w:sz w:val="16"/>
-          <w:szCs w:val="16"/>
-        </w:rPr>
-      </w:pPr>
-      <w:r>
-        <w:rPr>
-          <w:rtl w:val="0"/>
-        </w:rPr>
-      </w:r>
-    </w:p>
-    <w:p>
-      <w:pPr>
-        <w:tabs>
-          <w:tab w:val="left" w:leader="none" w:pos="1276"/>
-          <w:tab w:val="left" w:leader="none" w:pos="3261"/>
-          <w:tab w:val="left" w:leader="none" w:pos="7230"/>
-        </w:tabs>
-        <w:spacing w:after="0" w:line="240" w:lineRule="auto"/>
-        <w:rPr>
-          <w:sz w:val="16"/>
-          <w:szCs w:val="16"/>
-        </w:rPr>
-      </w:pPr>
-      <w:r>
-        <w:rPr>
-          <w:rtl w:val="0"/>
-        </w:rPr>
-      </w:r>
-    </w:p>
-    <w:p>
-      <w:pPr>
-        <w:tabs>
-          <w:tab w:val="left" w:leader="none" w:pos="1276"/>
-          <w:tab w:val="left" w:leader="none" w:pos="3261"/>
-          <w:tab w:val="left" w:leader="none" w:pos="7230"/>
-        </w:tabs>
-        <w:spacing w:after="0" w:line="240" w:lineRule="auto"/>
-        <w:rPr>
-          <w:sz w:val="16"/>
-          <w:szCs w:val="16"/>
-        </w:rPr>
-      </w:pPr>
-      <w:r>
-        <w:rPr>
-          <w:rtl w:val="0"/>
-        </w:rPr>
-      </w:r>
-    </w:p>
-    <w:p>
-      <w:pPr>
-        <w:tabs>
-          <w:tab w:val="left" w:leader="none" w:pos="1276"/>
-          <w:tab w:val="left" w:leader="none" w:pos="3261"/>
-          <w:tab w:val="left" w:leader="none" w:pos="7230"/>
-        </w:tabs>
-        <w:spacing w:after="0" w:line="240" w:lineRule="auto"/>
-        <w:rPr>
-          <w:sz w:val="16"/>
-          <w:szCs w:val="16"/>
-        </w:rPr>
-      </w:pPr>
-      <w:r>
-        <w:rPr>
-          <w:rtl w:val="0"/>
-        </w:rPr>
-      </w:r>
-    </w:p>
-    <w:p>
-      <w:pPr>
-        <w:tabs>
-          <w:tab w:val="left" w:leader="none" w:pos="1276"/>
-          <w:tab w:val="left" w:leader="none" w:pos="3261"/>
-          <w:tab w:val="left" w:leader="none" w:pos="7230"/>
-        </w:tabs>
-        <w:spacing w:after="0" w:line="240" w:lineRule="auto"/>
-        <w:rPr>
-          <w:sz w:val="16"/>
-          <w:szCs w:val="16"/>
-        </w:rPr>
-      </w:pPr>
-      <w:r>
-        <w:rPr>
-          <w:rtl w:val="0"/>
-        </w:rPr>
-      </w:r>
-    </w:p>
-    <w:p>
-      <w:pPr>
-        <w:tabs>
-          <w:tab w:val="left" w:leader="none" w:pos="1276"/>
-          <w:tab w:val="left" w:leader="none" w:pos="3261"/>
-          <w:tab w:val="left" w:leader="none" w:pos="7230"/>
-        </w:tabs>
-        <w:spacing w:after="0" w:line="240" w:lineRule="auto"/>
-        <w:rPr>
-          <w:sz w:val="16"/>
-          <w:szCs w:val="16"/>
-        </w:rPr>
-      </w:pPr>
-      <w:r>
-        <w:rPr>
-          <w:rtl w:val="0"/>
-        </w:rPr>
-      </w:r>
-    </w:p>
-    <w:p>
-      <w:pPr>
-        <w:spacing w:after="0" w:line="240" w:lineRule="auto"/>
-        <w:rPr>
-          <w:sz w:val="16"/>
-          <w:szCs w:val="16"/>
-        </w:rPr>
-      </w:pPr>
-      <w:r>
-        <w:rPr>
-          <w:rtl w:val="0"/>
-        </w:rPr>
-      </w:r>
-    </w:p>
-    <w:p>
-      <w:pPr>
-        <w:spacing w:after="0" w:line="240" w:lineRule="auto"/>
-        <w:rPr>
-          <w:sz w:val="16"/>
-          <w:szCs w:val="16"/>
-        </w:rPr>
-      </w:pPr>
-      <w:r>
-        <w:rPr>
-          <w:rtl w:val="0"/>
-        </w:rPr>
-      </w:r>
-    </w:p>
-    <w:p>
-      <w:pPr>
-        <w:spacing w:after="0" w:line="240" w:lineRule="auto"/>
-        <w:rPr>
-          <w:sz w:val="16"/>
-          <w:szCs w:val="16"/>
-        </w:rPr>
-      </w:pPr>
-      <w:r>
-        <w:rPr>
-          <w:rtl w:val="0"/>
-        </w:rPr>
-      </w:r>
-    </w:p>
-    <w:p>
-      <w:pPr>
-        <w:spacing w:after="0" w:line="240" w:lineRule="auto"/>
-        <w:rPr>
-          <w:rFonts w:ascii="Calibri" w:cs="Calibri" w:eastAsia="Calibri" w:hAnsi="Calibri"/>
-          <w:sz w:val="20"/>
-          <w:szCs w:val="20"/>
-        </w:rPr>
-      </w:pPr>
-      <w:r>
-        <w:rPr>
-          <w:rtl w:val="0"/>
-        </w:rPr>
-      </w:r>
-    </w:p>
-    <w:p>
-      <w:pPr>
-        <w:spacing w:after="0" w:line="240" w:lineRule="auto"/>
-        <w:rPr>
-          <w:rFonts w:ascii="Calibri" w:cs="Calibri" w:eastAsia="Calibri" w:hAnsi="Calibri"/>
-          <w:sz w:val="20"/>
-          <w:szCs w:val="20"/>
-        </w:rPr>
-      </w:pPr>
-      <w:r>
-        <w:rPr>
-          <w:rtl w:val="0"/>
-        </w:rPr>
-      </w:r>
-    </w:p>
-    <w:p>
-      <w:pPr>
-        <w:spacing w:after="0" w:line="240" w:lineRule="auto"/>
-        <w:rPr>
-          <w:sz w:val="20"/>
-          <w:szCs w:val="20"/>
-        </w:rPr>
-      </w:pPr>
-      <w:r>
-        <w:rPr>
-          <w:rtl w:val="0"/>
-        </w:rPr>
-      </w:r>
-    </w:p>
-    <w:p>
-      <w:pPr>
-        <w:spacing w:after="0" w:line="240" w:lineRule="auto"/>
-        <w:ind w:firstLine="708"/>
-        <w:jc w:val="right"/>
-        <w:rPr>
-          <w:rFonts w:ascii="Calibri" w:cs="Calibri" w:eastAsia="Calibri" w:hAnsi="Calibri"/>
-          <w:color w:val="1a1915"/>
-          <w:sz w:val="18"/>
-          <w:szCs w:val="18"/>
-        </w:rPr>
-      </w:pPr>
-      <w:r>
-        <w:rPr>
-          <w:rFonts w:ascii="Calibri" w:cs="Calibri" w:eastAsia="Calibri" w:hAnsi="Calibri"/>
-          <w:sz w:val="20"/>
-          <w:szCs w:val="20"/>
-          <w:rtl w:val="0"/>
-        </w:rPr>
-        <w:t xml:space="preserve">       </w:t>
-      </w:r>
-      <w:r>
-        <w:rPr>
-          <w:rtl w:val="0"/>
-        </w:rPr>
-      </w:r>
-      <w:r>
-        <mc:AlternateContent>
-          <mc:Choice Requires="wpg">
-            <w:drawing>
-              <wp:anchor allowOverlap="1" behindDoc="0" distB="0" distT="0" distL="114300" distR="114300" hidden="0" layoutInCell="1" locked="0" relativeHeight="0" simplePos="0">
-                <wp:simplePos x="0" y="0"/>
-                <wp:positionH relativeFrom="column">
-                  <wp:posOffset>37466</wp:posOffset>
-                </wp:positionH>
-                <wp:positionV relativeFrom="paragraph">
-                  <wp:posOffset>17780</wp:posOffset>
-                </wp:positionV>
-                <wp:extent cx="5810250" cy="12700"/>
-                <wp:effectExtent b="0" l="0" r="0" t="0"/>
-                <wp:wrapNone/>
-                <wp:docPr id="1" name=""/>
-                <a:graphic>
-                  <a:graphicData uri="http://schemas.microsoft.com/office/word/2010/wordprocessingShape">
-                    <wps:wsp>
-                      <wps:cNvCnPr/>
-                      <wps:spPr>
-                        <a:xfrm>
-                          <a:off x="2440875" y="3780000"/>
-                          <a:ext cx="5810250" cy="0"/>
-                        </a:xfrm>
-                        <a:prstGeom prst="straightConnector1">
-                          <a:avLst/>
-                        </a:prstGeom>
-                        <a:noFill/>
-                        <a:ln cap="flat" cmpd="sng" w="9525">
-                          <a:solidFill>
-                            <a:srgbClr val="AEABAB"/>
-                          </a:solidFill>
-                          <a:prstDash val="solid"/>
-                          <a:miter lim="800000"/>
-                          <a:headEnd len="sm" w="sm" type="none"/>
-                          <a:tailEnd len="sm" w="sm" type="none"/>
-                        </a:ln>
-                      </wps:spPr>
-                      <wps:bodyPr anchorCtr="0" anchor="ctr" bIns="91425" lIns="91425" spcFirstLastPara="1" rIns="91425" wrap="square" tIns="91425">
-                        <a:noAutofit/>
-                      </wps:bodyPr>
-                    </wps:wsp>
-                  </a:graphicData>
-                </a:graphic>
-              </wp:anchor>
-            </w:drawing>
-          </mc:Choice>
-          <mc:Fallback>
-            <w:drawing>
-              <wp:anchor allowOverlap="1" behindDoc="0" distB="0" distT="0" distL="114300" distR="114300" hidden="0" layoutInCell="1" locked="0" relativeHeight="0" simplePos="0">
-                <wp:simplePos x="0" y="0"/>
-                <wp:positionH relativeFrom="column">
-                  <wp:posOffset>37466</wp:posOffset>
-                </wp:positionH>
-                <wp:positionV relativeFrom="paragraph">
-                  <wp:posOffset>17780</wp:posOffset>
-                </wp:positionV>
-                <wp:extent cx="5810250" cy="12700"/>
-                <wp:effectExtent b="0" l="0" r="0" t="0"/>
-                <wp:wrapNone/>
-                <wp:docPr id="1" name="image6.png"/>
-                <a:graphic>
-                  <a:graphicData uri="http://schemas.openxmlformats.org/drawingml/2006/picture">
-                    <pic:pic>
-                      <pic:nvPicPr>
-                        <pic:cNvPr id="0" name="image6.png"/>
-                        <pic:cNvPicPr preferRelativeResize="0"/>
-                      </pic:nvPicPr>
-                      <pic:blipFill>
-                        <a:blip r:embed="rId11"/>
-                        <a:srcRect/>
-                        <a:stretch>
-                          <a:fillRect/>
-                        </a:stretch>
-                      </pic:blipFill>
-                      <pic:spPr>
-                        <a:xfrm>
-                          <a:off x="0" y="0"/>
-                          <a:ext cx="5810250" cy="12700"/>
-                        </a:xfrm>
-                        <a:prstGeom prst="rect"/>
-                        <a:ln/>
-                      </pic:spPr>
-                    </pic:pic>
-                  </a:graphicData>
-                </a:graphic>
-              </wp:anchor>
-            </w:drawing>
-          </mc:Fallback>
-        </mc:AlternateContent>
-      </w:r>
-    </w:p>
-    <w:p>
-      <w:pPr>
-        <w:spacing w:after="0" w:line="240" w:lineRule="auto"/>
-        <w:rPr>
-          <w:sz w:val="16"/>
-          <w:szCs w:val="16"/>
-        </w:rPr>
-      </w:pPr>
-      <w:r>
-        <w:rPr>
-          <w:sz w:val="16"/>
-          <w:szCs w:val="16"/>
-          <w:rtl w:val="0"/>
-        </w:rPr>
-        <w:t xml:space="preserve">Dongemond Klimaattechniek B.V</w:t>
-      </w:r>
-      <w:r>
-        <w:rPr>
-          <w:color w:val="4d8cac"/>
-          <w:sz w:val="16"/>
-          <w:szCs w:val="16"/>
-          <w:rtl w:val="0"/>
-        </w:rPr>
-        <w:t xml:space="preserve">               </w:t>
-        <w:tab/>
-        <w:t xml:space="preserve">       </w:t>
-      </w:r>
-      <w:r>
-        <w:rPr>
-          <w:sz w:val="16"/>
-          <w:szCs w:val="16"/>
-          <w:rtl w:val="0"/>
-        </w:rPr>
-        <w:t xml:space="preserve">Telefoon:  0162-750861</w:t>
-      </w:r>
-      <w:r>
-        <w:rPr>
-          <w:color w:val="4d8cac"/>
-          <w:sz w:val="16"/>
-          <w:szCs w:val="16"/>
-          <w:rtl w:val="0"/>
-        </w:rPr>
-        <w:t xml:space="preserve">          </w:t>
-        <w:tab/>
-        <w:tab/>
-        <w:t xml:space="preserve">                                            </w:t>
-      </w:r>
-      <w:r>
-        <w:rPr>
-          <w:sz w:val="16"/>
-          <w:szCs w:val="16"/>
-          <w:rtl w:val="0"/>
-        </w:rPr>
-        <w:t xml:space="preserve">KvK: 71245340</w:t>
-      </w:r>
-    </w:p>
-    <w:p>
-      <w:pPr>
-        <w:tabs>
-          <w:tab w:val="left" w:leader="none" w:pos="3285"/>
-        </w:tabs>
-        <w:spacing w:after="0" w:line="240" w:lineRule="auto"/>
-        <w:rPr>
-          <w:color w:val="1a1915"/>
-          <w:sz w:val="16"/>
-          <w:szCs w:val="16"/>
-        </w:rPr>
-      </w:pPr>
-      <w:r>
-        <w:rPr>
-          <w:sz w:val="16"/>
-          <w:szCs w:val="16"/>
-          <w:rtl w:val="0"/>
-        </w:rPr>
-        <w:t xml:space="preserve">Benedenkerkstraat 57                                               Email: </w:t>
-      </w:r>
-      <w:hyperlink r:id="rId12">
-        <w:r>
-          <w:rPr>
-            <w:sz w:val="16"/>
-            <w:szCs w:val="16"/>
-            <w:u w:val="single"/>
-            <w:rtl w:val="0"/>
-          </w:rPr>
-          <w:t xml:space="preserve">info@dongemondklimaattechniek.nl</w:t>
-        </w:r>
-      </w:hyperlink>
-      <w:r>
-        <w:rPr>
-          <w:sz w:val="16"/>
-          <w:szCs w:val="16"/>
-          <w:rtl w:val="0"/>
-        </w:rPr>
-        <w:t xml:space="preserve">                                       BtwNr: NL858635471B01</w:t>
-      </w:r>
-      <w:r>
-        <w:rPr>
-          <w:rtl w:val="0"/>
-        </w:rPr>
-      </w:r>
-    </w:p>
-    <w:p>
-      <w:pPr>
-        <w:spacing w:after="0" w:line="240" w:lineRule="auto"/>
-        <w:rPr>
-          <w:sz w:val="16"/>
-          <w:szCs w:val="16"/>
-        </w:rPr>
-      </w:pPr>
-      <w:bookmarkStart w:colFirst="0" w:colLast="0" w:name="_szqe08wi9zvs" w:id="1"/>
-      <w:bookmarkEnd w:id="1"/>
-      <w:r>
-        <w:rPr>
-          <w:sz w:val="16"/>
-          <w:szCs w:val="16"/>
-          <w:rtl w:val="0"/>
-        </w:rPr>
-        <w:t xml:space="preserve">5165 CA Waspik                 </w:t>
-      </w:r>
-      <w:r>
-        <w:rPr>
-          <w:color w:val="4d8cac"/>
-          <w:sz w:val="16"/>
-          <w:szCs w:val="16"/>
-          <w:rtl w:val="0"/>
-        </w:rPr>
-        <w:tab/>
-        <w:tab/>
-      </w:r>
-      <w:r>
-        <w:rPr>
-          <w:sz w:val="16"/>
-          <w:szCs w:val="16"/>
-          <w:rtl w:val="0"/>
-        </w:rPr>
-        <w:t xml:space="preserve">       Website: www.dongemondklimaattechniek.nl </w:t>
-      </w:r>
-      <w:r>
-        <w:rPr>
-          <w:color w:val="4d8cac"/>
-          <w:sz w:val="16"/>
-          <w:szCs w:val="16"/>
-          <w:rtl w:val="0"/>
-        </w:rPr>
-        <w:tab/>
-      </w:r>
-      <w:r>
-        <w:rPr>
-          <w:sz w:val="16"/>
-          <w:szCs w:val="16"/>
-          <w:rtl w:val="0"/>
-        </w:rPr>
-        <w:t xml:space="preserve">                        IBAN: NL07RABO0329224719</w:t>
-      </w:r>
-      <w:r>
-        <w:rPr>
-          <w:rtl w:val="0"/>
-        </w:rPr>
+      <w:r>
+        <w:br w:type="page"/>
       </w:r>
     </w:p>
     <w:p>
@@ -2018,6 +1431,11 @@
     </w:p>
     <w:p>
       <w:r>
+        <w:br w:type="page"/>
+      </w:r>
+    </w:p>
+    <w:p>
+      <w:r>
         <w:t>{#acOptions}</w:t>
       </w:r>
     </w:p>
@@ -2066,6 +1484,11 @@
     </w:p>
     <w:p>
       <w:r>
+        <w:br w:type="page"/>
+      </w:r>
+    </w:p>
+    <w:p>
+      <w:r>
         <w:t>{/acOptions}</w:t>
       </w:r>
     </w:p>
@@ -2086,6 +1509,11 @@
           <w:szCs w:val="20"/>
         </w:rPr>
         <w:t>{acClosing}</w:t>
+      </w:r>
+    </w:p>
+    <w:p>
+      <w:r>
+        <w:br w:type="page"/>
       </w:r>
     </w:p>
     <w:p>
@@ -4803,12 +4231,16 @@
     </w:p>
     <w:sectPr>
       <w:headerReference r:id="rId15" w:type="default"/>
+      <w:footerReference w:type="default" r:id="rId_footer1"/>
       <w:pgSz w:h="16838" w:w="11906" w:orient="portrait"/>
       <w:pgMar w:bottom="1440" w:top="1440" w:left="1531" w:right="1098" w:header="708" w:footer="708"/>
       <w:pgNumType w:start="1"/>
     </w:sectPr>
   </w:body>
 </w:document>
+</file>
+
+<file path=word/footer1.xml><?xml version="1.0" encoding="UTF-8" standalone="yes"?><w:ftr xmlns:mc="http://schemas.openxmlformats.org/markup-compatibility/2006" xmlns:o="urn:schemas-microsoft-com:office:office" xmlns:r="http://schemas.openxmlformats.org/officeDocument/2006/relationships" xmlns:m="http://schemas.openxmlformats.org/officeDocument/2006/math" xmlns:v="urn:schemas-microsoft-com:vml" xmlns:wp="http://schemas.openxmlformats.org/drawingml/2006/wordprocessingDrawing" xmlns:w10="urn:schemas-microsoft-com:office:word" xmlns:w="http://schemas.openxmlformats.org/wordprocessingml/2006/main" xmlns:wne="http://schemas.microsoft.com/office/word/2006/wordml" xmlns:sl="http://schemas.openxmlformats.org/schemaLibrary/2006/main" xmlns:a="http://schemas.openxmlformats.org/drawingml/2006/main" xmlns:pic="http://schemas.openxmlformats.org/drawingml/2006/picture" xmlns:c="http://schemas.openxmlformats.org/drawingml/2006/chart" xmlns:lc="http://schemas.openxmlformats.org/drawingml/2006/lockedCanvas" xmlns:dgm="http://schemas.openxmlformats.org/drawingml/2006/diagram" xmlns:wps="http://schemas.microsoft.com/office/word/2010/wordprocessingShape" xmlns:wpg="http://schemas.microsoft.com/office/word/2010/wordprocessingGroup" xmlns:w14="http://schemas.microsoft.com/office/word/2010/wordml" xmlns:w15="http://schemas.microsoft.com/office/word/2012/wordml"><w:p><w:p><w:pPr><w:pBdr><w:top w:val="single" w:sz="6" w:space="1" w:color="AEABAB"/></w:pBdr><w:spacing w:after="60" w:before="0"/></w:pPr></w:p><w:p><w:pPr><w:spacing w:after="0" w:line="240" w:lineRule="auto"/><w:rPr><w:sz w:val="16"/><w:szCs w:val="16"/></w:rPr></w:pPr><w:r><w:rPr><w:sz w:val="16"/><w:szCs w:val="16"/><w:rtl w:val="0"/></w:rPr><w:t xml:space="preserve">Dongemond Klimaattechniek B.V</w:t></w:r><w:r><w:rPr><w:color w:val="4d8cac"/><w:sz w:val="16"/><w:szCs w:val="16"/><w:rtl w:val="0"/></w:rPr><w:t xml:space="preserve">               </w:t><w:tab/><w:t xml:space="preserve">       </w:t></w:r><w:r><w:rPr><w:sz w:val="16"/><w:szCs w:val="16"/><w:rtl w:val="0"/></w:rPr><w:t xml:space="preserve">Telefoon:  0162-750861</w:t></w:r><w:r><w:rPr><w:color w:val="4d8cac"/><w:sz w:val="16"/><w:szCs w:val="16"/><w:rtl w:val="0"/></w:rPr><w:t xml:space="preserve">          </w:t><w:tab/><w:tab/><w:t xml:space="preserve">                                            </w:t></w:r><w:r><w:rPr><w:sz w:val="16"/><w:szCs w:val="16"/><w:rtl w:val="0"/></w:rPr><w:t xml:space="preserve">KvK: 71245340</w:t></w:r></w:p><w:p><w:pPr><w:tabs><w:tab w:val="left" w:leader="none" w:pos="3285"/></w:tabs><w:spacing w:after="0" w:line="240" w:lineRule="auto"/><w:rPr><w:color w:val="1a1915"/><w:sz w:val="16"/><w:szCs w:val="16"/></w:rPr></w:pPr><w:r><w:rPr><w:sz w:val="16"/><w:szCs w:val="16"/><w:rtl w:val="0"/></w:rPr><w:t xml:space="preserve">Benedenkerkstraat 57                                               Email: </w:t></w:r><w:hyperlink r:id="rId12"><w:r><w:rPr><w:sz w:val="16"/><w:szCs w:val="16"/><w:u w:val="single"/><w:rtl w:val="0"/></w:rPr><w:t xml:space="preserve">info@dongemondklimaattechniek.nl</w:t></w:r></w:hyperlink><w:r><w:rPr><w:sz w:val="16"/><w:szCs w:val="16"/><w:rtl w:val="0"/></w:rPr><w:t xml:space="preserve">                                       BtwNr: NL858635471B01</w:t></w:r><w:r><w:rPr><w:rtl w:val="0"/></w:rPr></w:r></w:p><w:p><w:pPr><w:spacing w:after="0" w:line="240" w:lineRule="auto"/><w:rPr><w:sz w:val="16"/><w:szCs w:val="16"/></w:rPr></w:pPr><w:bookmarkStart w:colFirst="0" w:colLast="0" w:name="_szqe08wi9zvs" w:id="1"/><w:bookmarkEnd w:id="1"/><w:r><w:rPr><w:sz w:val="16"/><w:szCs w:val="16"/><w:rtl w:val="0"/></w:rPr><w:t xml:space="preserve">5165 CA Waspik                 </w:t></w:r><w:r><w:rPr><w:color w:val="4d8cac"/><w:sz w:val="16"/><w:szCs w:val="16"/><w:rtl w:val="0"/></w:rPr><w:tab/><w:tab/></w:r><w:r><w:rPr><w:sz w:val="16"/><w:szCs w:val="16"/><w:rtl w:val="0"/></w:rPr><w:t xml:space="preserve">       Website: www.dongemondklimaattechniek.nl </w:t></w:r><w:r><w:rPr><w:color w:val="4d8cac"/><w:sz w:val="16"/><w:szCs w:val="16"/><w:rtl w:val="0"/></w:rPr><w:tab/></w:r><w:r><w:rPr><w:sz w:val="16"/><w:szCs w:val="16"/><w:rtl w:val="0"/></w:rPr><w:t xml:space="preserve">                        IBAN: NL07RABO0329224719</w:t></w:r><w:r><w:rPr><w:rtl w:val="0"/></w:rPr></w:r></w:p><w:p><w:pPr><w:spacing w:after="0"/></w:pPr></w:p></w:ftr>
 </file>
 
 <file path=word/header1.xml><?xml version="1.0" encoding="utf-8"?>

</xml_diff>